<commit_message>
Update cover: fill in member info and course details
Cover now shows a single card for the individual submission (Leonardo
Marsiarelli, RM 555366, 3SIOA) and the course line reads
"FIAP - Fase 5 - Mobile Hybrid App - 02/09/2026", in both the
documentation (Word/PDF) and the presentation (PPTX/PDF).
</commit_message>
<xml_diff>
--- a/docs/Documentacao_Smart_HAS.docx
+++ b/docs/Documentacao_Smart_HAS.docx
@@ -80,7 +80,7 @@
           <w:sz w:val="22"/>
           <w:szCs w:val="22"/>
         </w:rPr>
-        <w:t xml:space="preserve">FIAP — [Nome da Disciplina/Fase]</w:t>
+        <w:t xml:space="preserve">FIAP — Fase 5 - Mobile Hybrid App — 02/09/2026</w:t>
       </w:r>
     </w:p>
     <w:p>
@@ -89,7 +89,7 @@
         <w:spacing w:after="100" w:before="200"/>
       </w:pPr>
       <w:r>
-        <w:t xml:space="preserve">Integrantes do grupo</w:t>
+        <w:t xml:space="preserve">Integrante</w:t>
       </w:r>
     </w:p>
     <w:tbl>
@@ -221,7 +221,7 @@
                 <w:sz w:val="20"/>
                 <w:szCs w:val="20"/>
               </w:rPr>
-              <w:t xml:space="preserve">[Preencher nome do integrante 1]</w:t>
+              <w:t xml:space="preserve">Leonardo Marsiarelli</w:t>
             </w:r>
           </w:p>
         </w:tc>
@@ -247,7 +247,7 @@
                 <w:sz w:val="20"/>
                 <w:szCs w:val="20"/>
               </w:rPr>
-              <w:t xml:space="preserve">[RM]</w:t>
+              <w:t xml:space="preserve">555366</w:t>
             </w:r>
           </w:p>
         </w:tc>
@@ -273,253 +273,7 @@
                 <w:sz w:val="20"/>
                 <w:szCs w:val="20"/>
               </w:rPr>
-              <w:t xml:space="preserve">[Turma]</w:t>
-            </w:r>
-          </w:p>
-        </w:tc>
-      </w:tr>
-      <w:tr>
-        <w:tc>
-          <w:tcPr>
-            <w:tcW w:type="dxa" w:w="4600"/>
-            <w:shd w:fill="EAF2F4" w:val="clear"/>
-            <w:tcMar>
-              <w:top w:type="dxa" w:w="80"/>
-              <w:left w:type="dxa" w:w="100"/>
-              <w:bottom w:type="dxa" w:w="80"/>
-              <w:right w:type="dxa" w:w="100"/>
-            </w:tcMar>
-            <w:vAlign w:val="center"/>
-          </w:tcPr>
-          <w:p>
-            <w:pPr>
-              <w:jc w:val="left"/>
-            </w:pPr>
-            <w:r>
-              <w:rPr>
-                <w:b w:val="false"/>
-                <w:bCs w:val="false"/>
-                <w:sz w:val="20"/>
-                <w:szCs w:val="20"/>
-              </w:rPr>
-              <w:t xml:space="preserve">[Preencher nome do integrante 2]</w:t>
-            </w:r>
-          </w:p>
-        </w:tc>
-        <w:tc>
-          <w:tcPr>
-            <w:tcW w:type="dxa" w:w="2400"/>
-            <w:shd w:fill="EAF2F4" w:val="clear"/>
-            <w:tcMar>
-              <w:top w:type="dxa" w:w="80"/>
-              <w:left w:type="dxa" w:w="100"/>
-              <w:bottom w:type="dxa" w:w="80"/>
-              <w:right w:type="dxa" w:w="100"/>
-            </w:tcMar>
-            <w:vAlign w:val="center"/>
-          </w:tcPr>
-          <w:p>
-            <w:pPr>
-              <w:jc w:val="left"/>
-            </w:pPr>
-            <w:r>
-              <w:rPr>
-                <w:b w:val="false"/>
-                <w:bCs w:val="false"/>
-                <w:sz w:val="20"/>
-                <w:szCs w:val="20"/>
-              </w:rPr>
-              <w:t xml:space="preserve">[RM]</w:t>
-            </w:r>
-          </w:p>
-        </w:tc>
-        <w:tc>
-          <w:tcPr>
-            <w:tcW w:type="dxa" w:w="2400"/>
-            <w:shd w:fill="EAF2F4" w:val="clear"/>
-            <w:tcMar>
-              <w:top w:type="dxa" w:w="80"/>
-              <w:left w:type="dxa" w:w="100"/>
-              <w:bottom w:type="dxa" w:w="80"/>
-              <w:right w:type="dxa" w:w="100"/>
-            </w:tcMar>
-            <w:vAlign w:val="center"/>
-          </w:tcPr>
-          <w:p>
-            <w:pPr>
-              <w:jc w:val="left"/>
-            </w:pPr>
-            <w:r>
-              <w:rPr>
-                <w:b w:val="false"/>
-                <w:bCs w:val="false"/>
-                <w:sz w:val="20"/>
-                <w:szCs w:val="20"/>
-              </w:rPr>
-              <w:t xml:space="preserve">[Turma]</w:t>
-            </w:r>
-          </w:p>
-        </w:tc>
-      </w:tr>
-      <w:tr>
-        <w:tc>
-          <w:tcPr>
-            <w:tcW w:type="dxa" w:w="4600"/>
-            <w:tcMar>
-              <w:top w:type="dxa" w:w="80"/>
-              <w:left w:type="dxa" w:w="100"/>
-              <w:bottom w:type="dxa" w:w="80"/>
-              <w:right w:type="dxa" w:w="100"/>
-            </w:tcMar>
-            <w:vAlign w:val="center"/>
-          </w:tcPr>
-          <w:p>
-            <w:pPr>
-              <w:jc w:val="left"/>
-            </w:pPr>
-            <w:r>
-              <w:rPr>
-                <w:b w:val="false"/>
-                <w:bCs w:val="false"/>
-                <w:sz w:val="20"/>
-                <w:szCs w:val="20"/>
-              </w:rPr>
-              <w:t xml:space="preserve">[Preencher nome do integrante 3]</w:t>
-            </w:r>
-          </w:p>
-        </w:tc>
-        <w:tc>
-          <w:tcPr>
-            <w:tcW w:type="dxa" w:w="2400"/>
-            <w:tcMar>
-              <w:top w:type="dxa" w:w="80"/>
-              <w:left w:type="dxa" w:w="100"/>
-              <w:bottom w:type="dxa" w:w="80"/>
-              <w:right w:type="dxa" w:w="100"/>
-            </w:tcMar>
-            <w:vAlign w:val="center"/>
-          </w:tcPr>
-          <w:p>
-            <w:pPr>
-              <w:jc w:val="left"/>
-            </w:pPr>
-            <w:r>
-              <w:rPr>
-                <w:b w:val="false"/>
-                <w:bCs w:val="false"/>
-                <w:sz w:val="20"/>
-                <w:szCs w:val="20"/>
-              </w:rPr>
-              <w:t xml:space="preserve">[RM]</w:t>
-            </w:r>
-          </w:p>
-        </w:tc>
-        <w:tc>
-          <w:tcPr>
-            <w:tcW w:type="dxa" w:w="2400"/>
-            <w:tcMar>
-              <w:top w:type="dxa" w:w="80"/>
-              <w:left w:type="dxa" w:w="100"/>
-              <w:bottom w:type="dxa" w:w="80"/>
-              <w:right w:type="dxa" w:w="100"/>
-            </w:tcMar>
-            <w:vAlign w:val="center"/>
-          </w:tcPr>
-          <w:p>
-            <w:pPr>
-              <w:jc w:val="left"/>
-            </w:pPr>
-            <w:r>
-              <w:rPr>
-                <w:b w:val="false"/>
-                <w:bCs w:val="false"/>
-                <w:sz w:val="20"/>
-                <w:szCs w:val="20"/>
-              </w:rPr>
-              <w:t xml:space="preserve">[Turma]</w:t>
-            </w:r>
-          </w:p>
-        </w:tc>
-      </w:tr>
-      <w:tr>
-        <w:tc>
-          <w:tcPr>
-            <w:tcW w:type="dxa" w:w="4600"/>
-            <w:shd w:fill="EAF2F4" w:val="clear"/>
-            <w:tcMar>
-              <w:top w:type="dxa" w:w="80"/>
-              <w:left w:type="dxa" w:w="100"/>
-              <w:bottom w:type="dxa" w:w="80"/>
-              <w:right w:type="dxa" w:w="100"/>
-            </w:tcMar>
-            <w:vAlign w:val="center"/>
-          </w:tcPr>
-          <w:p>
-            <w:pPr>
-              <w:jc w:val="left"/>
-            </w:pPr>
-            <w:r>
-              <w:rPr>
-                <w:b w:val="false"/>
-                <w:bCs w:val="false"/>
-                <w:sz w:val="20"/>
-                <w:szCs w:val="20"/>
-              </w:rPr>
-              <w:t xml:space="preserve">[Preencher nome do integrante 4]</w:t>
-            </w:r>
-          </w:p>
-        </w:tc>
-        <w:tc>
-          <w:tcPr>
-            <w:tcW w:type="dxa" w:w="2400"/>
-            <w:shd w:fill="EAF2F4" w:val="clear"/>
-            <w:tcMar>
-              <w:top w:type="dxa" w:w="80"/>
-              <w:left w:type="dxa" w:w="100"/>
-              <w:bottom w:type="dxa" w:w="80"/>
-              <w:right w:type="dxa" w:w="100"/>
-            </w:tcMar>
-            <w:vAlign w:val="center"/>
-          </w:tcPr>
-          <w:p>
-            <w:pPr>
-              <w:jc w:val="left"/>
-            </w:pPr>
-            <w:r>
-              <w:rPr>
-                <w:b w:val="false"/>
-                <w:bCs w:val="false"/>
-                <w:sz w:val="20"/>
-                <w:szCs w:val="20"/>
-              </w:rPr>
-              <w:t xml:space="preserve">[RM]</w:t>
-            </w:r>
-          </w:p>
-        </w:tc>
-        <w:tc>
-          <w:tcPr>
-            <w:tcW w:type="dxa" w:w="2400"/>
-            <w:shd w:fill="EAF2F4" w:val="clear"/>
-            <w:tcMar>
-              <w:top w:type="dxa" w:w="80"/>
-              <w:left w:type="dxa" w:w="100"/>
-              <w:bottom w:type="dxa" w:w="80"/>
-              <w:right w:type="dxa" w:w="100"/>
-            </w:tcMar>
-            <w:vAlign w:val="center"/>
-          </w:tcPr>
-          <w:p>
-            <w:pPr>
-              <w:jc w:val="left"/>
-            </w:pPr>
-            <w:r>
-              <w:rPr>
-                <w:b w:val="false"/>
-                <w:bCs w:val="false"/>
-                <w:sz w:val="20"/>
-                <w:szCs w:val="20"/>
-              </w:rPr>
-              <w:t xml:space="preserve">[Turma]</w:t>
+              <w:t xml:space="preserve">3SIOA</w:t>
             </w:r>
           </w:p>
         </w:tc>
@@ -545,7 +299,7 @@
           <w:sz w:val="18"/>
           <w:szCs w:val="18"/>
         </w:rPr>
-        <w:t xml:space="preserve">Observação: adicione ou remova linhas conforme o número real de integrantes do grupo.</w:t>
+        <w:t xml:space="preserve">Entrega individual.</w:t>
       </w:r>
     </w:p>
     <w:p>

</xml_diff>